<commit_message>
toFixed & packing list fix
</commit_message>
<xml_diff>
--- a/electron/database/generate-document/templates/order-processing-form.docx
+++ b/electron/database/generate-document/templates/order-processing-form.docx
@@ -4,8 +4,7 @@
   <w:body>
     <w:tbl>
       <w:tblPr>
-        <w:tblW w:w="16040" w:type="dxa"/>
-        <w:tblInd w:w="-160" w:type="dxa"/>
+        <w:tblW w:w="0" w:type="auto"/>
         <w:tblBorders>
           <w:top w:val="single" w:sz="6" w:space="0" w:color="000000"/>
           <w:left w:val="single" w:sz="6" w:space="0" w:color="000000"/>
@@ -14,26 +13,25 @@
           <w:insideH w:val="single" w:sz="6" w:space="0" w:color="000000"/>
           <w:insideV w:val="single" w:sz="6" w:space="0" w:color="000000"/>
         </w:tblBorders>
-        <w:tblLayout w:type="fixed"/>
         <w:tblCellMar>
-          <w:left w:w="28" w:type="dxa"/>
-          <w:right w:w="0" w:type="dxa"/>
+          <w:left w:w="113" w:type="dxa"/>
+          <w:right w:w="113" w:type="dxa"/>
         </w:tblCellMar>
         <w:tblLook w:val="01E0" w:firstRow="1" w:lastRow="1" w:firstColumn="1" w:lastColumn="1" w:noHBand="0" w:noVBand="0"/>
       </w:tblPr>
       <w:tblGrid>
-        <w:gridCol w:w="1464"/>
-        <w:gridCol w:w="1134"/>
-        <w:gridCol w:w="1843"/>
-        <w:gridCol w:w="1276"/>
-        <w:gridCol w:w="2409"/>
-        <w:gridCol w:w="709"/>
-        <w:gridCol w:w="1701"/>
-        <w:gridCol w:w="992"/>
-        <w:gridCol w:w="1134"/>
-        <w:gridCol w:w="993"/>
-        <w:gridCol w:w="850"/>
-        <w:gridCol w:w="1535"/>
+        <w:gridCol w:w="5443"/>
+        <w:gridCol w:w="888"/>
+        <w:gridCol w:w="965"/>
+        <w:gridCol w:w="972"/>
+        <w:gridCol w:w="1131"/>
+        <w:gridCol w:w="754"/>
+        <w:gridCol w:w="1627"/>
+        <w:gridCol w:w="726"/>
+        <w:gridCol w:w="842"/>
+        <w:gridCol w:w="704"/>
+        <w:gridCol w:w="858"/>
+        <w:gridCol w:w="1020"/>
       </w:tblGrid>
       <w:tr>
         <w:trPr>
@@ -41,7 +39,7 @@
         </w:trPr>
         <w:tc>
           <w:tcPr>
-            <w:tcW w:w="16040" w:type="dxa"/>
+            <w:tcW w:w="0" w:type="auto"/>
             <w:gridSpan w:val="12"/>
           </w:tcPr>
           <w:p>
@@ -184,7 +182,7 @@
         </w:trPr>
         <w:tc>
           <w:tcPr>
-            <w:tcW w:w="1464" w:type="dxa"/>
+            <w:tcW w:w="0" w:type="auto"/>
           </w:tcPr>
           <w:p>
             <w:pPr>
@@ -205,7 +203,7 @@
         </w:tc>
         <w:tc>
           <w:tcPr>
-            <w:tcW w:w="7371" w:type="dxa"/>
+            <w:tcW w:w="0" w:type="auto"/>
             <w:gridSpan w:val="5"/>
           </w:tcPr>
           <w:p>
@@ -259,7 +257,7 @@
         </w:tc>
         <w:tc>
           <w:tcPr>
-            <w:tcW w:w="3827" w:type="dxa"/>
+            <w:tcW w:w="0" w:type="auto"/>
             <w:gridSpan w:val="3"/>
           </w:tcPr>
           <w:p>
@@ -324,7 +322,7 @@
         </w:tc>
         <w:tc>
           <w:tcPr>
-            <w:tcW w:w="3378" w:type="dxa"/>
+            <w:tcW w:w="0" w:type="auto"/>
             <w:gridSpan w:val="3"/>
           </w:tcPr>
           <w:p>
@@ -405,7 +403,8 @@
         </w:trPr>
         <w:tc>
           <w:tcPr>
-            <w:tcW w:w="1464" w:type="dxa"/>
+            <w:tcW w:w="0" w:type="auto"/>
+            <w:vAlign w:val="center"/>
           </w:tcPr>
           <w:p>
             <w:pPr>
@@ -433,7 +432,8 @@
         </w:tc>
         <w:tc>
           <w:tcPr>
-            <w:tcW w:w="1134" w:type="dxa"/>
+            <w:tcW w:w="0" w:type="auto"/>
+            <w:vAlign w:val="center"/>
           </w:tcPr>
           <w:p>
             <w:pPr>
@@ -455,7 +455,8 @@
         </w:tc>
         <w:tc>
           <w:tcPr>
-            <w:tcW w:w="1843" w:type="dxa"/>
+            <w:tcW w:w="0" w:type="auto"/>
+            <w:vAlign w:val="center"/>
           </w:tcPr>
           <w:p>
             <w:pPr>
@@ -477,7 +478,8 @@
         </w:tc>
         <w:tc>
           <w:tcPr>
-            <w:tcW w:w="1276" w:type="dxa"/>
+            <w:tcW w:w="0" w:type="auto"/>
+            <w:vAlign w:val="center"/>
           </w:tcPr>
           <w:p>
             <w:pPr>
@@ -492,25 +494,20 @@
               <w:rPr>
                 <w:sz w:val="20"/>
               </w:rPr>
-              <w:t xml:space="preserve">    </w:t>
-            </w:r>
-            <w:r>
-              <w:rPr>
-                <w:sz w:val="20"/>
-              </w:rPr>
               <w:t>BRAND</w:t>
             </w:r>
           </w:p>
         </w:tc>
         <w:tc>
           <w:tcPr>
-            <w:tcW w:w="2409" w:type="dxa"/>
+            <w:tcW w:w="0" w:type="auto"/>
+            <w:vAlign w:val="center"/>
           </w:tcPr>
           <w:p>
             <w:pPr>
               <w:pStyle w:val="TableParagraph"/>
               <w:spacing w:before="50"/>
-              <w:ind w:left="363"/>
+              <w:jc w:val="center"/>
               <w:rPr>
                 <w:sz w:val="20"/>
               </w:rPr>
@@ -520,25 +517,20 @@
                 <w:spacing w:val="-2"/>
                 <w:sz w:val="20"/>
               </w:rPr>
-              <w:t xml:space="preserve">      </w:t>
-            </w:r>
-            <w:r>
-              <w:rPr>
-                <w:spacing w:val="-2"/>
-                <w:sz w:val="20"/>
-              </w:rPr>
               <w:t>GRADE</w:t>
             </w:r>
           </w:p>
         </w:tc>
         <w:tc>
           <w:tcPr>
-            <w:tcW w:w="709" w:type="dxa"/>
+            <w:tcW w:w="0" w:type="auto"/>
+            <w:vAlign w:val="center"/>
           </w:tcPr>
           <w:p>
             <w:pPr>
               <w:pStyle w:val="TableParagraph"/>
               <w:spacing w:before="50"/>
+              <w:jc w:val="center"/>
               <w:rPr>
                 <w:sz w:val="20"/>
               </w:rPr>
@@ -548,20 +540,14 @@
                 <w:spacing w:val="-5"/>
                 <w:sz w:val="20"/>
               </w:rPr>
-              <w:t xml:space="preserve">  </w:t>
-            </w:r>
-            <w:r>
-              <w:rPr>
-                <w:spacing w:val="-5"/>
-                <w:sz w:val="20"/>
-              </w:rPr>
               <w:t>QTY</w:t>
             </w:r>
           </w:p>
         </w:tc>
         <w:tc>
           <w:tcPr>
-            <w:tcW w:w="1701" w:type="dxa"/>
+            <w:tcW w:w="0" w:type="auto"/>
+            <w:vAlign w:val="center"/>
           </w:tcPr>
           <w:p>
             <w:pPr>
@@ -584,7 +570,8 @@
         </w:tc>
         <w:tc>
           <w:tcPr>
-            <w:tcW w:w="992" w:type="dxa"/>
+            <w:tcW w:w="0" w:type="auto"/>
+            <w:vAlign w:val="center"/>
           </w:tcPr>
           <w:p>
             <w:pPr>
@@ -606,7 +593,8 @@
         </w:tc>
         <w:tc>
           <w:tcPr>
-            <w:tcW w:w="1134" w:type="dxa"/>
+            <w:tcW w:w="0" w:type="auto"/>
+            <w:vAlign w:val="center"/>
           </w:tcPr>
           <w:p>
             <w:pPr>
@@ -628,7 +616,8 @@
         </w:tc>
         <w:tc>
           <w:tcPr>
-            <w:tcW w:w="993" w:type="dxa"/>
+            <w:tcW w:w="0" w:type="auto"/>
+            <w:vAlign w:val="center"/>
           </w:tcPr>
           <w:p>
             <w:pPr>
@@ -650,12 +639,14 @@
         </w:tc>
         <w:tc>
           <w:tcPr>
-            <w:tcW w:w="850" w:type="dxa"/>
+            <w:tcW w:w="0" w:type="auto"/>
+            <w:vAlign w:val="center"/>
           </w:tcPr>
           <w:p>
             <w:pPr>
               <w:pStyle w:val="TableParagraph"/>
               <w:spacing w:before="50"/>
+              <w:jc w:val="center"/>
               <w:rPr>
                 <w:sz w:val="20"/>
               </w:rPr>
@@ -665,20 +656,21 @@
                 <w:spacing w:val="-5"/>
                 <w:sz w:val="20"/>
               </w:rPr>
-              <w:t xml:space="preserve">    </w:t>
+              <w:t>BAL</w:t>
             </w:r>
             <w:r>
               <w:rPr>
                 <w:spacing w:val="-5"/>
                 <w:sz w:val="20"/>
               </w:rPr>
-              <w:t>BAL</w:t>
-            </w:r>
-          </w:p>
-        </w:tc>
-        <w:tc>
-          <w:tcPr>
-            <w:tcW w:w="1535" w:type="dxa"/>
+              <w:t>ANCE</w:t>
+            </w:r>
+          </w:p>
+        </w:tc>
+        <w:tc>
+          <w:tcPr>
+            <w:tcW w:w="0" w:type="auto"/>
+            <w:vAlign w:val="center"/>
           </w:tcPr>
           <w:p>
             <w:pPr>
@@ -705,7 +697,7 @@
         </w:trPr>
         <w:tc>
           <w:tcPr>
-            <w:tcW w:w="1464" w:type="dxa"/>
+            <w:tcW w:w="0" w:type="auto"/>
           </w:tcPr>
           <w:p>
             <w:pPr>
@@ -909,7 +901,7 @@
         </w:tc>
         <w:tc>
           <w:tcPr>
-            <w:tcW w:w="1134" w:type="dxa"/>
+            <w:tcW w:w="0" w:type="auto"/>
           </w:tcPr>
           <w:p>
             <w:pPr>
@@ -949,7 +941,7 @@
         </w:tc>
         <w:tc>
           <w:tcPr>
-            <w:tcW w:w="1843" w:type="dxa"/>
+            <w:tcW w:w="0" w:type="auto"/>
           </w:tcPr>
           <w:p>
             <w:pPr>
@@ -990,7 +982,7 @@
         </w:tc>
         <w:tc>
           <w:tcPr>
-            <w:tcW w:w="1276" w:type="dxa"/>
+            <w:tcW w:w="0" w:type="auto"/>
           </w:tcPr>
           <w:p>
             <w:pPr>
@@ -1024,7 +1016,7 @@
         </w:tc>
         <w:tc>
           <w:tcPr>
-            <w:tcW w:w="2409" w:type="dxa"/>
+            <w:tcW w:w="0" w:type="auto"/>
           </w:tcPr>
           <w:p>
             <w:pPr>
@@ -1062,7 +1054,7 @@
         </w:tc>
         <w:tc>
           <w:tcPr>
-            <w:tcW w:w="709" w:type="dxa"/>
+            <w:tcW w:w="0" w:type="auto"/>
           </w:tcPr>
           <w:p>
             <w:pPr>
@@ -1084,7 +1076,7 @@
         </w:tc>
         <w:tc>
           <w:tcPr>
-            <w:tcW w:w="1701" w:type="dxa"/>
+            <w:tcW w:w="0" w:type="auto"/>
           </w:tcPr>
           <w:p>
             <w:pPr>
@@ -1164,7 +1156,7 @@
         </w:tc>
         <w:tc>
           <w:tcPr>
-            <w:tcW w:w="992" w:type="dxa"/>
+            <w:tcW w:w="0" w:type="auto"/>
           </w:tcPr>
           <w:p>
             <w:pPr>
@@ -1178,7 +1170,7 @@
         </w:tc>
         <w:tc>
           <w:tcPr>
-            <w:tcW w:w="1134" w:type="dxa"/>
+            <w:tcW w:w="0" w:type="auto"/>
           </w:tcPr>
           <w:p>
             <w:pPr>
@@ -1192,7 +1184,7 @@
         </w:tc>
         <w:tc>
           <w:tcPr>
-            <w:tcW w:w="993" w:type="dxa"/>
+            <w:tcW w:w="0" w:type="auto"/>
           </w:tcPr>
           <w:p>
             <w:pPr>
@@ -1206,7 +1198,7 @@
         </w:tc>
         <w:tc>
           <w:tcPr>
-            <w:tcW w:w="850" w:type="dxa"/>
+            <w:tcW w:w="0" w:type="auto"/>
           </w:tcPr>
           <w:p>
             <w:pPr>
@@ -1220,7 +1212,7 @@
         </w:tc>
         <w:tc>
           <w:tcPr>
-            <w:tcW w:w="1535" w:type="dxa"/>
+            <w:tcW w:w="0" w:type="auto"/>
           </w:tcPr>
           <w:p>
             <w:pPr>

</xml_diff>